<commit_message>
Rewrite the Level 4 lines the checker could not hear
Lesson 1 says "we have" where Whisper dropped "we've." Lesson 2 says Parkview, four eighteen Elm Street, and a full start-date question. Lesson 3 says "those shelves are done" and "we have already." Lesson 4 says the blood pressure looks normal. Each lesson's grammar stays.
</commit_message>
<xml_diff>
--- a/level4/curriculum/Level4_Lesson1.docx
+++ b/level4/curriculum/Level4_Lesson1.docx
@@ -4812,7 +4812,7 @@
                 <w:i w:val="0"/>
                 <w:sz w:val="23"/>
               </w:rPr>
-              <w:t>gonna</w:t>
+              <w:t>going to</w:t>
             </w:r>
             <w:r>
               <w:rPr>
@@ -4844,7 +4844,7 @@
                 <w:i w:val="0"/>
                 <w:sz w:val="23"/>
               </w:rPr>
-              <w:t>wanna</w:t>
+              <w:t>want to</w:t>
             </w:r>
             <w:r>
               <w:rPr>
@@ -4852,7 +4852,7 @@
                 <w:i w:val="0"/>
                 <w:sz w:val="23"/>
               </w:rPr>
-              <w:t xml:space="preserve"> go camping." Say: "You will hear </w:t>
+              <w:t xml:space="preserve"> go camping." Say: "People often say </w:t>
             </w:r>
             <w:r>
               <w:rPr>
@@ -4884,7 +4884,7 @@
                 <w:i w:val="0"/>
                 <w:sz w:val="23"/>
               </w:rPr>
-              <w:t xml:space="preserve">. You can say </w:t>
+              <w:t xml:space="preserve">. This listening uses </w:t>
             </w:r>
             <w:r>
               <w:rPr>
@@ -4994,7 +4994,7 @@
                 <w:i w:val="0"/>
                 <w:sz w:val="23"/>
               </w:rPr>
-              <w:t xml:space="preserve"> read the script aloud with a volunteer (about 2:04), at a natural speed, two times. Say </w:t>
+              <w:t xml:space="preserve"> read the script aloud with a volunteer (about 2:06), at a natural speed, two times. The script says </w:t>
             </w:r>
             <w:r>
               <w:rPr>
@@ -5002,7 +5002,7 @@
                 <w:i/>
                 <w:sz w:val="23"/>
               </w:rPr>
-              <w:t>gonna</w:t>
+              <w:t>going to</w:t>
             </w:r>
             <w:r>
               <w:rPr>
@@ -5018,6 +5018,38 @@
                 <w:i/>
                 <w:sz w:val="23"/>
               </w:rPr>
+              <w:t>want to</w:t>
+            </w:r>
+            <w:r>
+              <w:rPr>
+                <w:b w:val="0"/>
+                <w:i w:val="0"/>
+                <w:sz w:val="23"/>
+              </w:rPr>
+              <w:t xml:space="preserve">. People often say </w:t>
+            </w:r>
+            <w:r>
+              <w:rPr>
+                <w:b w:val="0"/>
+                <w:i/>
+                <w:sz w:val="23"/>
+              </w:rPr>
+              <w:t>gonna</w:t>
+            </w:r>
+            <w:r>
+              <w:rPr>
+                <w:b w:val="0"/>
+                <w:i w:val="0"/>
+                <w:sz w:val="23"/>
+              </w:rPr>
+              <w:t xml:space="preserve"> and </w:t>
+            </w:r>
+            <w:r>
+              <w:rPr>
+                <w:b w:val="0"/>
+                <w:i/>
+                <w:sz w:val="23"/>
+              </w:rPr>
               <w:t>wanna</w:t>
             </w:r>
             <w:r>
@@ -5026,7 +5058,7 @@
                 <w:i w:val="0"/>
                 <w:sz w:val="23"/>
               </w:rPr>
-              <w:t xml:space="preserve"> where the script has them. When the audio is ready, it plays the conversation once; press play again for play 2. A third play is fine if the class needs it.</w:t>
+              <w:t>; learners only need to recognize those words. When the audio is ready, it plays the conversation once; press play again for play 2. A third play is fine if the class needs it.</w:t>
             </w:r>
           </w:p>
           <w:p>
@@ -6747,7 +6779,7 @@
           <w:color w:val="1B6F7A"/>
           <w:sz w:val="30"/>
         </w:rPr>
-        <w:t>Listening script (not recorded yet; about 2:04 when recorded; the conversation plays once, so press play again for the second listen)</w:t>
+        <w:t>Listening script (not recorded yet; about 2:06 when recorded; the conversation plays once, so press play again for the second listen)</w:t>
       </w:r>
     </w:p>
     <w:tbl>
@@ -6796,7 +6828,7 @@
                 <w:i w:val="0"/>
                 <w:sz w:val="22"/>
               </w:rPr>
-              <w:t xml:space="preserve"> the recording is coming soon. Until then, read the script aloud two times, with a volunteer if you can, at a natural, friendly speed. Say </w:t>
+              <w:t xml:space="preserve"> the recording is coming soon. Until then, read the script aloud two times, with a volunteer if you can, at a natural, friendly speed. The script says </w:t>
             </w:r>
             <w:r>
               <w:rPr>
@@ -6804,7 +6836,7 @@
                 <w:i/>
                 <w:sz w:val="22"/>
               </w:rPr>
-              <w:t>gonna</w:t>
+              <w:t>going to</w:t>
             </w:r>
             <w:r>
               <w:rPr>
@@ -6820,6 +6852,38 @@
                 <w:i/>
                 <w:sz w:val="22"/>
               </w:rPr>
+              <w:t>want to</w:t>
+            </w:r>
+            <w:r>
+              <w:rPr>
+                <w:b w:val="0"/>
+                <w:i w:val="0"/>
+                <w:sz w:val="22"/>
+              </w:rPr>
+              <w:t xml:space="preserve">. People often say </w:t>
+            </w:r>
+            <w:r>
+              <w:rPr>
+                <w:b w:val="0"/>
+                <w:i/>
+                <w:sz w:val="22"/>
+              </w:rPr>
+              <w:t>gonna</w:t>
+            </w:r>
+            <w:r>
+              <w:rPr>
+                <w:b w:val="0"/>
+                <w:i w:val="0"/>
+                <w:sz w:val="22"/>
+              </w:rPr>
+              <w:t xml:space="preserve"> and </w:t>
+            </w:r>
+            <w:r>
+              <w:rPr>
+                <w:b w:val="0"/>
+                <w:i/>
+                <w:sz w:val="22"/>
+              </w:rPr>
               <w:t>wanna</w:t>
             </w:r>
             <w:r>
@@ -6828,7 +6892,7 @@
                 <w:i w:val="0"/>
                 <w:sz w:val="22"/>
               </w:rPr>
-              <w:t xml:space="preserve"> where the script has them.</w:t>
+              <w:t>; learners only need to recognize those words.</w:t>
             </w:r>
           </w:p>
         </w:tc>
@@ -7037,7 +7101,7 @@
                 <w:i w:val="0"/>
                 <w:sz w:val="22"/>
               </w:rPr>
-              <w:t xml:space="preserve"> Good evening! I'm Ms. Grant, your teacher. Tonight we're gonna find things we have in common.</w:t>
+              <w:t xml:space="preserve"> Good evening! I'm Ms. Grant, your teacher. Tonight we're going to find things we have in common.</w:t>
             </w:r>
           </w:p>
           <w:p>
@@ -7226,7 +7290,7 @@
                 <w:i w:val="0"/>
                 <w:sz w:val="22"/>
               </w:rPr>
-              <w:t xml:space="preserve"> Yes, I ran a five K last year. I didn't win, but I finished!</w:t>
+              <w:t xml:space="preserve"> Yes, I ran a 5k last year. I didn't win, but I finished!</w:t>
             </w:r>
           </w:p>
           <w:p>
@@ -7268,7 +7332,7 @@
                 <w:i w:val="0"/>
                 <w:sz w:val="22"/>
               </w:rPr>
-              <w:t xml:space="preserve"> Great. So we've both seen snow, and we've both run a race.</w:t>
+              <w:t xml:space="preserve"> Great. So we have both seen snow, and we have both run a race.</w:t>
             </w:r>
           </w:p>
           <w:p>
@@ -7289,7 +7353,7 @@
                 <w:i w:val="0"/>
                 <w:sz w:val="22"/>
               </w:rPr>
-              <w:t xml:space="preserve"> Good job! Now, what have you never done, but you wanna try?</w:t>
+              <w:t xml:space="preserve"> Good job! Now, what have you never done, but you want to try?</w:t>
             </w:r>
           </w:p>
           <w:p>
@@ -7310,7 +7374,7 @@
                 <w:i w:val="0"/>
                 <w:sz w:val="22"/>
               </w:rPr>
-              <w:t xml:space="preserve"> I wanna go camping. I've never slept in a tent.</w:t>
+              <w:t xml:space="preserve"> I want to go camping. I've never slept in a tent.</w:t>
             </w:r>
           </w:p>
           <w:p>
@@ -7331,7 +7395,7 @@
                 <w:i w:val="0"/>
                 <w:sz w:val="22"/>
               </w:rPr>
-              <w:t xml:space="preserve"> And I wanna try sushi. I've never eaten it.</w:t>
+              <w:t xml:space="preserve"> And I want to try sushi. I've never eaten it.</w:t>
             </w:r>
           </w:p>
           <w:p>
@@ -8051,7 +8115,7 @@
           <w:i w:val="0"/>
           <w:sz w:val="23"/>
         </w:rPr>
-        <w:t xml:space="preserve"> the listening has </w:t>
+        <w:t xml:space="preserve"> the listening says </w:t>
       </w:r>
       <w:r>
         <w:rPr>
@@ -8059,7 +8123,7 @@
           <w:i/>
           <w:sz w:val="23"/>
         </w:rPr>
-        <w:t>gonna</w:t>
+        <w:t>going to</w:t>
       </w:r>
       <w:r>
         <w:rPr>
@@ -8075,7 +8139,7 @@
           <w:i/>
           <w:sz w:val="23"/>
         </w:rPr>
-        <w:t>wanna</w:t>
+        <w:t>want to</w:t>
       </w:r>
       <w:r>
         <w:rPr>
@@ -8083,7 +8147,7 @@
           <w:i w:val="0"/>
           <w:sz w:val="23"/>
         </w:rPr>
-        <w:t xml:space="preserve">. Learners need to understand them; they can always say </w:t>
+        <w:t xml:space="preserve">. People often say </w:t>
       </w:r>
       <w:r>
         <w:rPr>
@@ -8091,7 +8155,7 @@
           <w:i/>
           <w:sz w:val="23"/>
         </w:rPr>
-        <w:t>going to</w:t>
+        <w:t>gonna</w:t>
       </w:r>
       <w:r>
         <w:rPr>
@@ -8107,7 +8171,7 @@
           <w:i/>
           <w:sz w:val="23"/>
         </w:rPr>
-        <w:t>want to</w:t>
+        <w:t>wanna</w:t>
       </w:r>
       <w:r>
         <w:rPr>
@@ -8115,7 +8179,7 @@
           <w:i w:val="0"/>
           <w:sz w:val="23"/>
         </w:rPr>
-        <w:t>.</w:t>
+        <w:t>. Learners only need to recognize the short forms; they can always say the full forms.</w:t>
       </w:r>
     </w:p>
     <w:p>
@@ -11423,7 +11487,7 @@
           <w:i w:val="0"/>
           <w:sz w:val="26"/>
         </w:rPr>
-        <w:t>gonna</w:t>
+        <w:t>going to</w:t>
       </w:r>
       <w:r>
         <w:rPr>
@@ -11455,7 +11519,7 @@
           <w:i w:val="0"/>
           <w:sz w:val="26"/>
         </w:rPr>
-        <w:t>wanna</w:t>
+        <w:t>want to</w:t>
       </w:r>
       <w:r>
         <w:rPr>

</xml_diff>

<commit_message>
Publish the Level 4 listening audio on the site.
All 13 gate-PASS files are named in the lesson books, the downloads, and the slides. Lessons 3 and 13 are the last two copies added to the site audio folder.
</commit_message>
<xml_diff>
--- a/level4/curriculum/Level4_Lesson1.docx
+++ b/level4/curriculum/Level4_Lesson1.docx
@@ -35,7 +35,7 @@
           <w:i w:val="0"/>
           <w:sz w:val="22"/>
         </w:rPr>
-        <w:t xml:space="preserve"> Draft for review; not published.</w:t>
+        <w:t xml:space="preserve"> Complete lesson (all 13 Level 4 lessons are published).</w:t>
       </w:r>
     </w:p>
     <w:p>
@@ -134,7 +134,25 @@
           <w:i w:val="0"/>
           <w:sz w:val="22"/>
         </w:rPr>
-        <w:t>). Listening audio: not recorded yet (coming soon); until then, read the listening script in this plan aloud.</w:t>
+        <w:t xml:space="preserve">). Audio: </w:t>
+      </w:r>
+      <w:r>
+        <w:rPr>
+          <w:rFonts w:ascii="Consolas" w:hAnsi="Consolas"/>
+          <w:b w:val="0"/>
+          <w:i w:val="0"/>
+          <w:color w:val="8B1A1A"/>
+          <w:sz w:val="22"/>
+        </w:rPr>
+        <w:t>audio/L4_L1_listening.mp3</w:t>
+      </w:r>
+      <w:r>
+        <w:rPr>
+          <w:b w:val="0"/>
+          <w:i w:val="0"/>
+          <w:sz w:val="22"/>
+        </w:rPr>
+        <w:t>.</w:t>
       </w:r>
     </w:p>
     <w:tbl>
@@ -484,7 +502,7 @@
                 <w:i w:val="0"/>
                 <w:sz w:val="19"/>
               </w:rPr>
-              <w:t>Picture and license credits</w:t>
+              <w:t>Picture, audio, and license credits</w:t>
             </w:r>
           </w:p>
         </w:tc>
@@ -2000,15 +2018,17 @@
                 <w:i w:val="0"/>
                 <w:sz w:val="23"/>
               </w:rPr>
-              <w:t xml:space="preserve">Listening: </w:t>
-            </w:r>
-            <w:r>
-              <w:rPr>
-                <w:b/>
-                <w:i w:val="0"/>
+              <w:t xml:space="preserve">Listening: phone + small speaker, </w:t>
+            </w:r>
+            <w:r>
+              <w:rPr>
+                <w:rFonts w:ascii="Consolas" w:hAnsi="Consolas"/>
+                <w:b w:val="0"/>
+                <w:i w:val="0"/>
+                <w:color w:val="8B1A1A"/>
                 <w:sz w:val="23"/>
               </w:rPr>
-              <w:t>no recording yet.</w:t>
+              <w:t>L4_L1_listening.mp3</w:t>
             </w:r>
             <w:r>
               <w:rPr>
@@ -2016,7 +2036,7 @@
                 <w:i w:val="0"/>
                 <w:sz w:val="23"/>
               </w:rPr>
-              <w:t xml:space="preserve"> Read the listening script aloud (with a volunteer if you can), at a natural speed, two times.</w:t>
+              <w:t xml:space="preserve"> (about 2:05). No speaker? Read the script aloud with a volunteer.</w:t>
             </w:r>
           </w:p>
           <w:p>
@@ -4986,7 +5006,7 @@
                 <w:i w:val="0"/>
                 <w:sz w:val="23"/>
               </w:rPr>
-              <w:t>No recording yet:</w:t>
+              <w:t>The audio plays the conversation once (about 2:05).</w:t>
             </w:r>
             <w:r>
               <w:rPr>
@@ -4994,7 +5014,7 @@
                 <w:i w:val="0"/>
                 <w:sz w:val="23"/>
               </w:rPr>
-              <w:t xml:space="preserve"> read the script aloud with a volunteer (about 2:06), at a natural speed, two times. The script says </w:t>
+              <w:t xml:space="preserve"> Press play again for play 2. A third play is fine if the class needs it. The script says </w:t>
             </w:r>
             <w:r>
               <w:rPr>
@@ -5058,7 +5078,7 @@
                 <w:i w:val="0"/>
                 <w:sz w:val="23"/>
               </w:rPr>
-              <w:t>; learners only need to recognize those words. When the audio is ready, it plays the conversation once; press play again for play 2. A third play is fine if the class needs it.</w:t>
+              <w:t>; learners only need to recognize those words.</w:t>
             </w:r>
           </w:p>
           <w:p>
@@ -6779,7 +6799,26 @@
           <w:color w:val="1B6F7A"/>
           <w:sz w:val="30"/>
         </w:rPr>
-        <w:t>Listening script (not recorded yet; about 2:06 when recorded; the conversation plays once, so press play again for the second listen)</w:t>
+        <w:t xml:space="preserve">Listening script: </w:t>
+      </w:r>
+      <w:r>
+        <w:rPr>
+          <w:rFonts w:ascii="Consolas" w:hAnsi="Consolas"/>
+          <w:b/>
+          <w:i w:val="0"/>
+          <w:color w:val="8B1A1A"/>
+          <w:sz w:val="30"/>
+        </w:rPr>
+        <w:t>L4_L1_listening.mp3</w:t>
+      </w:r>
+      <w:r>
+        <w:rPr>
+          <w:b/>
+          <w:i w:val="0"/>
+          <w:color w:val="1B6F7A"/>
+          <w:sz w:val="30"/>
+        </w:rPr>
+        <w:t xml:space="preserve"> (about 2:05; the conversation plays once, so press play again for the second listen)</w:t>
       </w:r>
     </w:p>
     <w:tbl>
@@ -6828,7 +6867,25 @@
                 <w:i w:val="0"/>
                 <w:sz w:val="22"/>
               </w:rPr>
-              <w:t xml:space="preserve"> the recording is coming soon. Until then, read the script aloud two times, with a volunteer if you can, at a natural, friendly speed. The script says </w:t>
+              <w:t xml:space="preserve"> play </w:t>
+            </w:r>
+            <w:r>
+              <w:rPr>
+                <w:rFonts w:ascii="Consolas" w:hAnsi="Consolas"/>
+                <w:b w:val="0"/>
+                <w:i w:val="0"/>
+                <w:color w:val="8B1A1A"/>
+                <w:sz w:val="22"/>
+              </w:rPr>
+              <w:t>L4_L1_listening.mp3</w:t>
+            </w:r>
+            <w:r>
+              <w:rPr>
+                <w:b w:val="0"/>
+                <w:i w:val="0"/>
+                <w:sz w:val="22"/>
+              </w:rPr>
+              <w:t xml:space="preserve"> from a phone + small speaker. No speaker? Read the script with a volunteer, at a natural, friendly speed. The script says </w:t>
             </w:r>
             <w:r>
               <w:rPr>
@@ -20671,7 +20728,7 @@
           <w:i w:val="0"/>
           <w:sz w:val="22"/>
         </w:rPr>
-        <w:t>Listening audio: not recorded yet. When it is made, it will use synthetic voices made with Chatterbox TTS (Resemble AI, MIT License), cloned from synthetic reference clips made with Kokoro-82M (Apache License 2.0), with no recordings of real people. The names and the story are invented.</w:t>
+        <w:t>Listening audio: synthetic voices made with Chatterbox TTS (Resemble AI, MIT License), cloned from synthetic reference clips made with Kokoro-82M (Apache License 2.0). No recordings of real people were used. Each file carries an inaudible Perth watermark marking it as AI-generated. The names and the story are invented.</w:t>
       </w:r>
     </w:p>
     <w:p>
@@ -20709,7 +20766,7 @@
         <w:color w:val="555555"/>
         <w:sz w:val="17"/>
       </w:rPr>
-      <w:t xml:space="preserve">Level 4 ESL · Lesson 1 · Draft for review   |   page </w:t>
+      <w:t xml:space="preserve">Level 4 ESL · Lesson 1   |   page </w:t>
     </w:r>
     <w:r>
       <w:rPr>

</xml_diff>

<commit_message>
Level 4: add the gonna/wanna everyday-English note to every lesson (#42)
Student Hear it box, teacher Reductions note, and the Hear It slide now say what
gonna and wanna mean, that learners will hear them, and when they are fine to use.
The recordings keep going to / want to. Rebuilt the 13 DOCX/PDF books, decks and
presenter JSON.
</commit_message>
<xml_diff>
--- a/level4/curriculum/Level4_Lesson1.docx
+++ b/level4/curriculum/Level4_Lesson1.docx
@@ -8204,7 +8204,7 @@
           <w:i w:val="0"/>
           <w:sz w:val="23"/>
         </w:rPr>
-        <w:t xml:space="preserve">. People often say </w:t>
+        <w:t xml:space="preserve">. Tell learners: people often say </w:t>
       </w:r>
       <w:r>
         <w:rPr>
@@ -8236,7 +8236,7 @@
           <w:i w:val="0"/>
           <w:sz w:val="23"/>
         </w:rPr>
-        <w:t>. Learners only need to recognize the short forms; they can always say the full forms.</w:t>
+        <w:t>, and they will hear them a lot. The short forms are fine in casual talk; in writing or at a job interview, use the full forms.</w:t>
       </w:r>
     </w:p>
     <w:p>
@@ -11584,7 +11584,39 @@
           <w:i w:val="0"/>
           <w:sz w:val="26"/>
         </w:rPr>
-        <w:t xml:space="preserve"> go camping." You can say </w:t>
+        <w:t xml:space="preserve"> go camping." People often say </w:t>
+      </w:r>
+      <w:r>
+        <w:rPr>
+          <w:b w:val="0"/>
+          <w:i/>
+          <w:sz w:val="26"/>
+        </w:rPr>
+        <w:t>gonna</w:t>
+      </w:r>
+      <w:r>
+        <w:rPr>
+          <w:b w:val="0"/>
+          <w:i w:val="0"/>
+          <w:sz w:val="26"/>
+        </w:rPr>
+        <w:t xml:space="preserve"> (going to) and </w:t>
+      </w:r>
+      <w:r>
+        <w:rPr>
+          <w:b w:val="0"/>
+          <w:i/>
+          <w:sz w:val="26"/>
+        </w:rPr>
+        <w:t>wanna</w:t>
+      </w:r>
+      <w:r>
+        <w:rPr>
+          <w:b w:val="0"/>
+          <w:i w:val="0"/>
+          <w:sz w:val="26"/>
+        </w:rPr>
+        <w:t xml:space="preserve"> (want to), and you will hear them a lot. They are fine with friends; in writing or at a job interview, use </w:t>
       </w:r>
       <w:r>
         <w:rPr>

</xml_diff>